<commit_message>
docs: refocus BTH reports on regional transition analysis
</commit_message>
<xml_diff>
--- a/analysis/reports/京津冀绿色转型三地概述.docx
+++ b/analysis/reports/京津冀绿色转型三地概述.docx
@@ -4,16 +4,11 @@
   <w:body>
     <w:p>
       <w:pPr>
+        <w:pStyle w:val="Title"/>
         <w:jc w:val="center"/>
       </w:pPr>
       <w:r>
-        <w:rPr>
-          <w:rFonts w:ascii="Arial" w:hAnsi="Arial" w:eastAsia="黑体"/>
-          <w:b/>
-          <w:color w:val="22577A"/>
-          <w:sz w:val="44"/>
-        </w:rPr>
-        <w:t>京津冀绿色转型政策概述</w:t>
+        <w:t>京津冀绿色转型概述</w:t>
       </w:r>
     </w:p>
     <w:p>
@@ -22,22 +17,10 @@
       </w:pPr>
       <w:r>
         <w:rPr>
-          <w:color w:val="52606D"/>
-          <w:sz w:val="21"/>
+          <w:color w:val="4B5563"/>
+          <w:sz w:val="22"/>
         </w:rPr>
-        <w:t>基于官方政策文本的地区观察（2023年9月—2026年9月）</w:t>
-      </w:r>
-    </w:p>
-    <w:p>
-      <w:pPr>
-        <w:jc w:val="center"/>
-      </w:pPr>
-      <w:r>
-        <w:rPr>
-          <w:color w:val="52606D"/>
-          <w:sz w:val="18"/>
-        </w:rPr>
-        <w:t>分析窗内收录 437 条；完整档案 502 条（含仍构成现行框架的基线文件）</w:t>
+        <w:t>产业结构 能源系统与城市治理</w:t>
       </w:r>
     </w:p>
     <w:p>
@@ -45,7 +28,7 @@
         <w:pStyle w:val="Heading1"/>
       </w:pPr>
       <w:r>
-        <w:t>一、北京：由目标管理转向项目全周期约束与技术扩散</w:t>
+        <w:t>1  北京</w:t>
       </w:r>
     </w:p>
     <w:p>
@@ -54,7 +37,7 @@
         <w:jc w:val="both"/>
       </w:pPr>
       <w:r>
-        <w:t>北京的绿色转型政策已形成“总量目标—项目准入—技术供给—场景落地”的连续链条。市级碳达峰方案提供能源、建筑、交通和产业的总框架；固定资产投资项目节能审查与碳排放评价办法把能耗和碳排放约束前移到项目决策环节，可再生能源开发利用条例及建设项目全过程监督办法进一步把开发利用责任嵌入规划、建设、验收和运行阶段。产业端的政策重心并非简单扩大新能源制造规模，而是通过绿色工厂、绿色供应链、节能技术目录、废旧动力电池回收和制造业绿色低碳支持措施，推动技术改造、资源循环与信息披露相衔接。空间上，西城以绿色低碳项目支持和公共机构示范为抓手，通州强调城市副中心工业与软件信息服务业转型，经开区突出先进制造业和园区场景，密云、丰台、东城等区则以区级碳达峰方案细化建筑、交通和生态治理任务。政策库中北京市级文件占比较高，区级文本已覆盖海淀、西城、丰台、密云、石景山、门头沟、东城、通州等区域；这说明政策工具正在向项目和基层治理单元下沉，但不同区公开目录的可检索程度不一，不能据收录量判断政策执行强弱。下一阶段，北京的关键不在于继续叠加原则性目标，而在于统一项目碳评价口径、将节能审查结果与绿色融资和政府采购衔接，并公开可比的年度实施数据，使技术示范能够转化为可核验的减排绩效。</w:t>
+        <w:t>北京的绿色转型已从目标设定转向投资决策、城市运行和技术应用的系统重塑。市级碳达峰方案构成总体框架，固定资产投资项目节能审查和碳排放评价把能源与碳约束前移至项目立项阶段，可再生能源开发利用条例以及建设项目全过程监督制度，则把开发利用责任延伸至规划、建设、验收和运行环节。产业政策的重点不是扩大高耗能制造，而是依托科技创新、数字经济和专业服务能力，提高节能技术、绿色工厂、绿色供应链与碳管理服务的扩散效率。建筑、交通和公共机构是城市端减排的主要场景，既有建筑改造、综合能源站、公共领域车辆电动化和废旧动力电池回收正在形成相互连接的政策链条。区级实践进一步体现功能差异：城市副中心重视产业与城市建设同步降碳，经开区突出先进制造业和园区转型，西城侧重公共机构与绿色项目支持，密云等生态涵养区更强调生态价值保护与低碳发展结合。北京面临的关键矛盾，是本地能源资源有限而能源消费和高品质城市运行需求刚性较强，因此其转型成效不仅取决于本地节能，还取决于能否通过绿电交易、跨区域能源基础设施和统一碳核算规则，将外部清洁能源供给转化为可核验的消费侧减排。同时，数据中心、人工智能等新型用能需求增长，要求北京在创新产业扩张与能效约束之间建立更精细的动态平衡。</w:t>
       </w:r>
     </w:p>
     <w:p>
@@ -184,7 +167,7 @@
         <w:pStyle w:val="Heading1"/>
       </w:pPr>
       <w:r>
-        <w:t>二、天津：以工业、港口和区级实施方案构成转型主轴</w:t>
+        <w:t>2  天津</w:t>
       </w:r>
     </w:p>
     <w:p>
@@ -193,7 +176,7 @@
         <w:jc w:val="both"/>
       </w:pPr>
       <w:r>
-        <w:t>天津的政策组合体现出典型港口工业城市的转型逻辑：一方面以市级碳达峰方案和工业领域碳达峰方案确定能源结构、工业能效与循环利用方向，另一方面通过固定资产投资项目节能审查和碳排放评价、温室气体重点排放单位核查指南等文件强化项目与企业层面的计量、核查和责任边界。能源端同时出现海上及陆上新能源项目、盐光互补、公共机构光伏、氢能与新能源汽车等政策信号；交通和城市治理端则将新能源车辆推广、港产城融合、厨余垃圾管理、非道路移动机械排放监管等纳入同一转型体系。区级政策的颗粒度是天津样本的突出特征：津南区形成可再生能源专项规划，静海、蓟州、宁河、宝坻、武清、东丽、北辰、红桥、南开、河东、河西、和平和河北区均可检索到碳达峰方案或年度生态环境行动，显示市级目标已经进入分区实施阶段。与此同时，政策文本之间仍存在指标口径、项目清单和年度进度公开程度不一致的问题；部分文件强调污染治理或单项工程，尚需明确其与碳目标之间的量化关系。建议以重点排放单位核查数据为基础，形成工业、港口、交通和建筑四类场景的年度进度表，并把区级方案中的目标、责任部门、项目和资金安排映射到同一数据框架，从而提高政策协同和实施可追踪性。</w:t>
+        <w:t>天津的绿色转型具有鲜明的港口工业城市特征，工业体系、港口物流和城市能源系统必须同步调整。市级碳达峰方案与工业领域碳达峰方案确定了能源结构优化、重点行业能效提升和资源循环利用的基本方向；固定资产投资项目节能审查与碳排放评价、温室气体重点排放单位核查等制度，则逐步把转型要求落实到企业和项目。能源方面，盐光互补、公共机构光伏、氢能和新能源汽车等应用，与天津既有的电力、石化和装备制造体系相互嵌合。交通方面，港口岸电、港内运输、重型货运和城市车辆更新共同决定港口经济的减排幅度，单纯扩大新能源车辆数量并不足以替代港航、铁路和公路之间的结构调整。工业方面，石化、钢铁、装备制造和汽车产业需要在设备更新、原料替代、过程电气化和资源循环利用之间形成连续改造路径。天津各区的转型条件差异明显：滨海新区承担港口和工业减排重任，津南等区域具备可再生能源项目基础，中心城区更侧重建筑、交通与公共机构节能。天津的优势在于产业链完整、港口场景集中，便于形成规模化示范；其难点在于存量设施资本强度高、更新周期长，能源价格、技术成熟度和产业竞争力会直接影响改造节奏。未来几年，天津能否把企业碳核查、港口能源数据和区级项目进度连接起来，将决定其能否从单项工程推进转向港产城整体转型。</w:t>
       </w:r>
     </w:p>
     <w:p>
@@ -323,7 +306,7 @@
         <w:pStyle w:val="Heading1"/>
       </w:pPr>
       <w:r>
-        <w:t>三、河北：产业减碳、城市空气质量与区域协同需同步推进</w:t>
+        <w:t>3  河北</w:t>
       </w:r>
     </w:p>
     <w:p>
@@ -332,7 +315,7 @@
         <w:jc w:val="both"/>
       </w:pPr>
       <w:r>
-        <w:t>河北的绿色转型具有更强的实体产业约束，钢铁、建材、化工、装备制造和能源系统既是减排重点，也是就业、投资和产业链安全的重要基础。河北省工业领域碳达峰实施方案将产业结构优化、节能降碳改造、绿色制造体系和资源综合利用置于核心位置；生态环境行政处罚裁量规则中的碳排放条款及地市监督执法清单，反映出碳排放责任正在与常态化环境监管接轨。城市层面，廊坊空气质量达标规划、石家庄生态环境治理文件、雄安新区生态环境制度以及张家口可再生能源示范基础，共同构成河北参与区域转型的不同路径。区域尺度上，《京津冀美丽中国先行区建设行动方案》要求三地在大气污染联防联控、生态保护修复、绿色交通和产业协作等方面形成跨行政区行动，这意味着河北不能仅以单个行业或城市的项目改造衡量转型，而需同时处理北京非首都功能疏解承接、清洁能源供给、重化工业改造和生态屏障建设之间的关系。当前政策库对河北的官方公开页面覆盖明显弱于京津，现有文本可用于识别政策主线和重点城市，但不足以据此比较各市执行绩效。后续应优先补齐唐山、邯郸、沧州、保定、张家口等重点城市的原始政策与年度实施文件，并建设行业—企业—项目三级台账；在政策设计上，应以单位产品碳排放、清洁能源消纳、绿色运输比例和重点工程进度等可核验指标，支撑产业升级与区域减排责任的协同评估。</w:t>
+        <w:t>河北的绿色转型首先是一场产业结构与能源供给方式的深度调整。钢铁、建材、化工和传统能源相关产业体量较大，使河北既承担较高的减排压力，也掌握京津冀产业链中不可替代的制造能力。工业领域碳达峰政策将节能降碳改造、绿色制造、资源综合利用和产业结构优化置于核心位置；对钢铁等行业而言，短期重点仍是能效提升、超低排放、余能利用和运输清洁化，中长期则取决于电炉钢、氢冶金、低碳原料和绿电供给的成本与规模。河北同时拥有张家口等可再生能源基地和广阔的新能源开发空间，其角色不仅是降低本地排放，也包括为京津提供稳定的清洁电力和调节能力。唐山、邯郸、沧州等工业城市需要处理高碳产业改造与就业、财政和产业链安全之间的关系；雄安新区可在绿色建筑、数字化能源管理和低碳城市基础设施方面形成增量示范；廊坊、保定等环京城市则与北京产业疏解、交通联系和空气质量协同高度相关。河北转型的难点在于成本和收益在区域间并不天然对称：清洁能源基地、生态保护和工业改造投资主要发生在河北，而部分能源消费和高附加值服务收益位于京津。由此，跨区域绿电交易、生态补偿、产业链协作和基础设施共建，不只是环境政策的补充，而是河北持续推进转型的重要经济条件。河北的转型速度最终取决于高碳产业能否形成具有市场竞争力的低碳产品，以及清洁能源优势能否转化为本地产业升级和长期收益。</w:t>
       </w:r>
     </w:p>
     <w:p>
@@ -874,14 +857,14 @@
     <w:pPr>
       <w:keepNext/>
       <w:keepLines/>
-      <w:spacing w:before="480" w:after="0"/>
+      <w:spacing w:before="280" w:after="160"/>
       <w:outlineLvl w:val="0"/>
     </w:pPr>
     <w:rPr>
       <w:rFonts w:asciiTheme="majorHAnsi" w:eastAsiaTheme="majorEastAsia" w:hAnsiTheme="majorHAnsi" w:cstheme="majorBidi" w:ascii="Arial" w:hAnsi="Arial" w:eastAsia="黑体"/>
       <w:b/>
       <w:bCs/>
-      <w:color w:val="22577A"/>
+      <w:color w:val="000000"/>
       <w:sz w:val="32"/>
       <w:szCs w:val="28"/>
     </w:rPr>
@@ -898,14 +881,14 @@
     <w:pPr>
       <w:keepNext/>
       <w:keepLines/>
-      <w:spacing w:before="200" w:after="0"/>
+      <w:spacing w:before="180" w:after="100"/>
       <w:outlineLvl w:val="1"/>
     </w:pPr>
     <w:rPr>
       <w:rFonts w:asciiTheme="majorHAnsi" w:eastAsiaTheme="majorEastAsia" w:hAnsiTheme="majorHAnsi" w:cstheme="majorBidi" w:ascii="Arial" w:hAnsi="Arial" w:eastAsia="黑体"/>
       <w:b/>
       <w:bCs/>
-      <w:color w:val="2A9D8F"/>
+      <w:color w:val="000000"/>
       <w:sz w:val="26"/>
       <w:szCs w:val="26"/>
     </w:rPr>
@@ -929,7 +912,7 @@
       <w:rFonts w:asciiTheme="majorHAnsi" w:eastAsiaTheme="majorEastAsia" w:hAnsiTheme="majorHAnsi" w:cstheme="majorBidi" w:ascii="Arial" w:hAnsi="Arial" w:eastAsia="黑体"/>
       <w:b/>
       <w:bCs/>
-      <w:color w:val="52606D"/>
+      <w:color w:val="000000"/>
       <w:sz w:val="22"/>
     </w:rPr>
   </w:style>
@@ -1161,16 +1144,13 @@
     <w:qFormat/>
     <w:rsid w:val="00FC693F"/>
     <w:pPr>
-      <w:pBdr>
-        <w:bottom w:val="single" w:sz="8" w:space="4" w:color="4F81BD" w:themeColor="accent1"/>
-      </w:pBdr>
       <w:spacing w:after="300" w:line="240" w:lineRule="auto"/>
       <w:contextualSpacing/>
     </w:pPr>
     <w:rPr>
       <w:rFonts w:asciiTheme="majorHAnsi" w:eastAsiaTheme="majorEastAsia" w:hAnsiTheme="majorHAnsi" w:cstheme="majorBidi" w:ascii="Arial" w:hAnsi="Arial" w:eastAsia="黑体"/>
       <w:b/>
-      <w:color w:val="22577A"/>
+      <w:color w:val="000000"/>
       <w:spacing w:val="5"/>
       <w:kern w:val="28"/>
       <w:sz w:val="44"/>

</xml_diff>